<commit_message>
feat: agregar archivos de transformacion proyecto
</commit_message>
<xml_diff>
--- a/Estado del Arte/Estado de Arte Practicum 2.2.docx
+++ b/Estado del Arte/Estado de Arte Practicum 2.2.docx
@@ -59,14 +59,14 @@
                         </a:ln>
                         <a:extLst>
                           <a:ext uri="{909E8E84-426E-40dd-AFC4-6F175D3DCCD1}">
-                            <a14:hiddenFill xmlns:oel="http://schemas.microsoft.com/office/2019/extlst" xmlns:w16du="http://schemas.microsoft.com/office/word/2023/wordml/word16du" xmlns:w16sdtfl="http://schemas.microsoft.com/office/word/2024/wordml/sdtformatlock" xmlns:arto="http://schemas.microsoft.com/office/word/2006/arto" xmlns:a14="http://schemas.microsoft.com/office/drawing/2010/main" xmlns:w="http://schemas.openxmlformats.org/wordprocessingml/2006/main" xmlns:w10="urn:schemas-microsoft-com:office:word" xmlns:v="urn:schemas-microsoft-com:vml" xmlns:o="urn:schemas-microsoft-com:office:office" xmlns:mv="urn:schemas-microsoft-com:mac:vml" xmlns:mo="http://schemas.microsoft.com/office/mac/office/2008/main" xmlns="" xmlns:pic="http://schemas.openxmlformats.org/drawingml/2006/picture">
+                            <a14:hiddenFill xmlns:pic="http://schemas.openxmlformats.org/drawingml/2006/picture" xmlns="" xmlns:mo="http://schemas.microsoft.com/office/mac/office/2008/main" xmlns:mv="urn:schemas-microsoft-com:mac:vml" xmlns:o="urn:schemas-microsoft-com:office:office" xmlns:v="urn:schemas-microsoft-com:vml" xmlns:w10="urn:schemas-microsoft-com:office:word" xmlns:w="http://schemas.openxmlformats.org/wordprocessingml/2006/main" xmlns:a14="http://schemas.microsoft.com/office/drawing/2010/main" xmlns:arto="http://schemas.microsoft.com/office/word/2006/arto" xmlns:w16sdtfl="http://schemas.microsoft.com/office/word/2024/wordml/sdtformatlock" xmlns:w16du="http://schemas.microsoft.com/office/word/2023/wordml/word16du" xmlns:oel="http://schemas.microsoft.com/office/2019/extlst">
                               <a:solidFill>
                                 <a:srgbClr val="FFFFFF"/>
                               </a:solidFill>
                             </a14:hiddenFill>
                           </a:ext>
                           <a:ext uri="{91240B29-F687-4f45-9708-019B960494DF}">
-                            <a14:hiddenLine xmlns:oel="http://schemas.microsoft.com/office/2019/extlst" xmlns:w16du="http://schemas.microsoft.com/office/word/2023/wordml/word16du" xmlns:w16sdtfl="http://schemas.microsoft.com/office/word/2024/wordml/sdtformatlock" xmlns:arto="http://schemas.microsoft.com/office/word/2006/arto" xmlns:a14="http://schemas.microsoft.com/office/drawing/2010/main" xmlns:w="http://schemas.openxmlformats.org/wordprocessingml/2006/main" xmlns:w10="urn:schemas-microsoft-com:office:word" xmlns:v="urn:schemas-microsoft-com:vml" xmlns:o="urn:schemas-microsoft-com:office:office" xmlns:mv="urn:schemas-microsoft-com:mac:vml" xmlns:mo="http://schemas.microsoft.com/office/mac/office/2008/main" xmlns="" xmlns:pic="http://schemas.openxmlformats.org/drawingml/2006/picture" w="9525">
+                            <a14:hiddenLine xmlns:pic="http://schemas.openxmlformats.org/drawingml/2006/picture" xmlns="" xmlns:mo="http://schemas.microsoft.com/office/mac/office/2008/main" xmlns:mv="urn:schemas-microsoft-com:mac:vml" xmlns:o="urn:schemas-microsoft-com:office:office" xmlns:v="urn:schemas-microsoft-com:vml" xmlns:w10="urn:schemas-microsoft-com:office:word" xmlns:w="http://schemas.openxmlformats.org/wordprocessingml/2006/main" xmlns:a14="http://schemas.microsoft.com/office/drawing/2010/main" xmlns:arto="http://schemas.microsoft.com/office/word/2006/arto" xmlns:w16sdtfl="http://schemas.microsoft.com/office/word/2024/wordml/sdtformatlock" xmlns:w16du="http://schemas.microsoft.com/office/word/2023/wordml/word16du" xmlns:oel="http://schemas.microsoft.com/office/2019/extlst" w="9525">
                               <a:solidFill>
                                 <a:srgbClr val="000000"/>
                               </a:solidFill>
@@ -187,7 +187,27 @@
                                 <w:color w:val="FFFFFF" w:themeColor="background1"/>
                                 <w:szCs w:val="28"/>
                               </w:rPr>
+                              <w:t>“</w:t>
+                            </w:r>
+                            <w:r>
+                              <w:rPr>
+                                <w:rFonts w:ascii="Arial" w:hAnsi="Arial" w:cs="Arial"/>
+                                <w:b/>
+                                <w:bCs/>
+                                <w:color w:val="FFFFFF" w:themeColor="background1"/>
+                                <w:szCs w:val="28"/>
+                              </w:rPr>
                               <w:t>Línea Unificada de Datos: Analítica, Ingeniería y Visualización</w:t>
+                            </w:r>
+                            <w:r>
+                              <w:rPr>
+                                <w:rFonts w:ascii="Arial" w:hAnsi="Arial" w:cs="Arial"/>
+                                <w:b/>
+                                <w:bCs/>
+                                <w:color w:val="FFFFFF" w:themeColor="background1"/>
+                                <w:szCs w:val="28"/>
+                              </w:rPr>
+                              <w:t>”</w:t>
                             </w:r>
                           </w:p>
                           <w:p>
@@ -384,7 +404,27 @@
                           <w:color w:val="FFFFFF" w:themeColor="background1"/>
                           <w:szCs w:val="28"/>
                         </w:rPr>
+                        <w:t>“</w:t>
+                      </w:r>
+                      <w:r>
+                        <w:rPr>
+                          <w:rFonts w:ascii="Arial" w:hAnsi="Arial" w:cs="Arial"/>
+                          <w:b/>
+                          <w:bCs/>
+                          <w:color w:val="FFFFFF" w:themeColor="background1"/>
+                          <w:szCs w:val="28"/>
+                        </w:rPr>
                         <w:t>Línea Unificada de Datos: Analítica, Ingeniería y Visualización</w:t>
+                      </w:r>
+                      <w:r>
+                        <w:rPr>
+                          <w:rFonts w:ascii="Arial" w:hAnsi="Arial" w:cs="Arial"/>
+                          <w:b/>
+                          <w:bCs/>
+                          <w:color w:val="FFFFFF" w:themeColor="background1"/>
+                          <w:szCs w:val="28"/>
+                        </w:rPr>
+                        <w:t>”</w:t>
                       </w:r>
                     </w:p>
                     <w:p>
@@ -5719,7 +5759,21 @@
                 <w:rFonts w:ascii="Arial" w:hAnsi="Arial" w:cs="Arial"/>
                 <w:sz w:val="22"/>
               </w:rPr>
-              <w:t>pandas suficiente</w:t>
+              <w:t>pandas</w:t>
+            </w:r>
+            <w:r>
+              <w:rPr>
+                <w:rFonts w:ascii="Arial" w:hAnsi="Arial" w:cs="Arial"/>
+                <w:sz w:val="22"/>
+              </w:rPr>
+              <w:t xml:space="preserve"> </w:t>
+            </w:r>
+            <w:r>
+              <w:rPr>
+                <w:rFonts w:ascii="Arial" w:hAnsi="Arial" w:cs="Arial"/>
+                <w:sz w:val="22"/>
+              </w:rPr>
+              <w:t>suficiente</w:t>
             </w:r>
             <w:proofErr w:type="gramEnd"/>
             <w:r>
@@ -8891,6 +8945,18 @@
         </w:rPr>
         <w:t xml:space="preserve">  </w:t>
       </w:r>
+      <w:hyperlink r:id="rId13" w:history="1">
+        <w:r>
+          <w:rPr>
+            <w:rStyle w:val="Hipervnculo"/>
+            <w:rFonts w:ascii="Arial" w:hAnsi="Arial" w:cs="Arial"/>
+            <w:sz w:val="22"/>
+            <w:szCs w:val="22"/>
+            <w:lang w:val="en-US"/>
+          </w:rPr>
+          <w:t>https://www.ibm.com/es-es/think/topics/elt-vs-etl</w:t>
+        </w:r>
+      </w:hyperlink>
       <w:r>
         <w:rPr>
           <w:rStyle w:val="url"/>
@@ -8899,16 +8965,8 @@
           <w:szCs w:val="22"/>
           <w:lang w:val="en-US"/>
         </w:rPr>
-        <w:t>https://www.ibm.com/es-es/think/topics/elt-vs-etl</w:t>
-      </w:r>
-    </w:p>
-    <w:p>
-      <w:pPr>
-        <w:pStyle w:val="Ttulo1"/>
-        <w:rPr>
-          <w:lang w:val="en-US"/>
-        </w:rPr>
-      </w:pPr>
+        <w:tab/>
+      </w:r>
     </w:p>
     <w:sectPr>
       <w:pgSz w:w="12240" w:h="15840" w:code="1"/>
@@ -14412,42 +14470,15 @@
 </file>
 
 <file path=customXml/item1.xml><?xml version="1.0" encoding="utf-8"?>
-<p:properties xmlns:p="http://schemas.microsoft.com/office/2006/metadata/properties" xmlns:xsi="http://www.w3.org/2001/XMLSchema-instance" xmlns:pc="http://schemas.microsoft.com/office/infopath/2007/PartnerControls">
-  <documentManagement>
-    <_activity xmlns="443cdf4c-6ee8-44c1-87a5-09d4e47d10ca" xsi:nil="true"/>
-  </documentManagement>
-</p:properties>
+<?mso-contentType ?>
+<FormTemplates xmlns="http://schemas.microsoft.com/sharepoint/v3/contenttype/forms">
+  <Display>DocumentLibraryForm</Display>
+  <Edit>DocumentLibraryForm</Edit>
+  <New>DocumentLibraryForm</New>
+</FormTemplates>
 </file>
 
 <file path=customXml/item2.xml><?xml version="1.0" encoding="utf-8"?>
-<b:Sources xmlns:b="http://schemas.openxmlformats.org/officeDocument/2006/bibliography" xmlns="http://schemas.openxmlformats.org/officeDocument/2006/bibliography" SelectedStyle="\APASixthEditionOfficeOnline.xsl" StyleName="APA" Version="6">
-  <b:Source>
-    <b:Tag>MMa22</b:Tag>
-    <b:SourceType>InternetSite</b:SourceType>
-    <b:Guid>{39565274-1ED4-4142-ABE1-D1F067E85F26}</b:Guid>
-    <b:Author>
-      <b:Author>
-        <b:NameList>
-          <b:Person>
-            <b:Last>Euklidiadas</b:Last>
-            <b:First>M.</b:First>
-            <b:Middle>Martínez</b:Middle>
-          </b:Person>
-        </b:NameList>
-      </b:Author>
-    </b:Author>
-    <b:Title>Discriminación algorítmica: qué es y ejemplos para entenderla</b:Title>
-    <b:InternetSiteTitle>Blog de Orange</b:InternetSiteTitle>
-    <b:Year>2022</b:Year>
-    <b:Month>January</b:Month>
-    <b:Day>21</b:Day>
-    <b:URL>https://blog.orange.es/innovacion/discriminacion-algoritmica/</b:URL>
-    <b:RefOrder>1</b:RefOrder>
-  </b:Source>
-</b:Sources>
-</file>
-
-<file path=customXml/item3.xml><?xml version="1.0" encoding="utf-8"?>
 <ct:contentTypeSchema xmlns:ct="http://schemas.microsoft.com/office/2006/metadata/contentType" xmlns:ma="http://schemas.microsoft.com/office/2006/metadata/properties/metaAttributes" ct:_="" ma:_="" ma:contentTypeName="Documento" ma:contentTypeID="0x010100A58565C13DBBB445B00B7E75C5B5878A" ma:contentTypeVersion="13" ma:contentTypeDescription="Crear nuevo documento." ma:contentTypeScope="" ma:versionID="c4d79febd5b5f7071a70519422a633fa">
   <xsd:schema xmlns:xsd="http://www.w3.org/2001/XMLSchema" xmlns:xs="http://www.w3.org/2001/XMLSchema" xmlns:p="http://schemas.microsoft.com/office/2006/metadata/properties" xmlns:ns3="443cdf4c-6ee8-44c1-87a5-09d4e47d10ca" xmlns:ns4="a4354016-0175-44fc-bf70-e655b97c80b7" targetNamespace="http://schemas.microsoft.com/office/2006/metadata/properties" ma:root="true" ma:fieldsID="0f7670bce0ccb192e28f25fa1aab2331" ns3:_="" ns4:_="">
     <xsd:import namespace="443cdf4c-6ee8-44c1-87a5-09d4e47d10ca"/>
@@ -14668,34 +14699,51 @@
 </ct:contentTypeSchema>
 </file>
 
+<file path=customXml/item3.xml><?xml version="1.0" encoding="utf-8"?>
+<b:Sources xmlns:b="http://schemas.openxmlformats.org/officeDocument/2006/bibliography" xmlns="http://schemas.openxmlformats.org/officeDocument/2006/bibliography" SelectedStyle="\APASixthEditionOfficeOnline.xsl" StyleName="APA" Version="6">
+  <b:Source>
+    <b:Tag>MMa22</b:Tag>
+    <b:SourceType>InternetSite</b:SourceType>
+    <b:Guid>{39565274-1ED4-4142-ABE1-D1F067E85F26}</b:Guid>
+    <b:Author>
+      <b:Author>
+        <b:NameList>
+          <b:Person>
+            <b:Last>Euklidiadas</b:Last>
+            <b:First>M.</b:First>
+            <b:Middle>Martínez</b:Middle>
+          </b:Person>
+        </b:NameList>
+      </b:Author>
+    </b:Author>
+    <b:Title>Discriminación algorítmica: qué es y ejemplos para entenderla</b:Title>
+    <b:InternetSiteTitle>Blog de Orange</b:InternetSiteTitle>
+    <b:Year>2022</b:Year>
+    <b:Month>January</b:Month>
+    <b:Day>21</b:Day>
+    <b:URL>https://blog.orange.es/innovacion/discriminacion-algoritmica/</b:URL>
+    <b:RefOrder>1</b:RefOrder>
+  </b:Source>
+</b:Sources>
+</file>
+
 <file path=customXml/item4.xml><?xml version="1.0" encoding="utf-8"?>
-<?mso-contentType ?>
-<FormTemplates xmlns="http://schemas.microsoft.com/sharepoint/v3/contenttype/forms">
-  <Display>DocumentLibraryForm</Display>
-  <Edit>DocumentLibraryForm</Edit>
-  <New>DocumentLibraryForm</New>
-</FormTemplates>
+<p:properties xmlns:p="http://schemas.microsoft.com/office/2006/metadata/properties" xmlns:xsi="http://www.w3.org/2001/XMLSchema-instance" xmlns:pc="http://schemas.microsoft.com/office/infopath/2007/PartnerControls">
+  <documentManagement>
+    <_activity xmlns="443cdf4c-6ee8-44c1-87a5-09d4e47d10ca" xsi:nil="true"/>
+  </documentManagement>
+</p:properties>
 </file>
 
 <file path=customXml/itemProps1.xml><?xml version="1.0" encoding="utf-8"?>
-<ds:datastoreItem xmlns:ds="http://schemas.openxmlformats.org/officeDocument/2006/customXml" ds:itemID="{C2CE5AFA-A240-4368-A225-A7240690C48B}">
+<ds:datastoreItem xmlns:ds="http://schemas.openxmlformats.org/officeDocument/2006/customXml" ds:itemID="{9D695571-27E0-4BAE-93F0-E583C028CFB1}">
   <ds:schemaRefs>
-    <ds:schemaRef ds:uri="http://schemas.microsoft.com/office/2006/metadata/properties"/>
-    <ds:schemaRef ds:uri="http://schemas.microsoft.com/office/infopath/2007/PartnerControls"/>
-    <ds:schemaRef ds:uri="443cdf4c-6ee8-44c1-87a5-09d4e47d10ca"/>
+    <ds:schemaRef ds:uri="http://schemas.microsoft.com/sharepoint/v3/contenttype/forms"/>
   </ds:schemaRefs>
 </ds:datastoreItem>
 </file>
 
 <file path=customXml/itemProps2.xml><?xml version="1.0" encoding="utf-8"?>
-<ds:datastoreItem xmlns:ds="http://schemas.openxmlformats.org/officeDocument/2006/customXml" ds:itemID="{20718E19-AD79-44D4-9E26-F9D8F3EE194E}">
-  <ds:schemaRefs>
-    <ds:schemaRef ds:uri="http://schemas.openxmlformats.org/officeDocument/2006/bibliography"/>
-  </ds:schemaRefs>
-</ds:datastoreItem>
-</file>
-
-<file path=customXml/itemProps3.xml><?xml version="1.0" encoding="utf-8"?>
 <ds:datastoreItem xmlns:ds="http://schemas.openxmlformats.org/officeDocument/2006/customXml" ds:itemID="{FF04B17E-AE84-4D17-BAF9-47A6AED97464}">
   <ds:schemaRefs>
     <ds:schemaRef ds:uri="http://schemas.microsoft.com/office/2006/metadata/contentType"/>
@@ -14714,10 +14762,20 @@
 </ds:datastoreItem>
 </file>
 
+<file path=customXml/itemProps3.xml><?xml version="1.0" encoding="utf-8"?>
+<ds:datastoreItem xmlns:ds="http://schemas.openxmlformats.org/officeDocument/2006/customXml" ds:itemID="{20718E19-AD79-44D4-9E26-F9D8F3EE194E}">
+  <ds:schemaRefs>
+    <ds:schemaRef ds:uri="http://schemas.openxmlformats.org/officeDocument/2006/bibliography"/>
+  </ds:schemaRefs>
+</ds:datastoreItem>
+</file>
+
 <file path=customXml/itemProps4.xml><?xml version="1.0" encoding="utf-8"?>
-<ds:datastoreItem xmlns:ds="http://schemas.openxmlformats.org/officeDocument/2006/customXml" ds:itemID="{9D695571-27E0-4BAE-93F0-E583C028CFB1}">
+<ds:datastoreItem xmlns:ds="http://schemas.openxmlformats.org/officeDocument/2006/customXml" ds:itemID="{C2CE5AFA-A240-4368-A225-A7240690C48B}">
   <ds:schemaRefs>
-    <ds:schemaRef ds:uri="http://schemas.microsoft.com/sharepoint/v3/contenttype/forms"/>
+    <ds:schemaRef ds:uri="http://schemas.microsoft.com/office/2006/metadata/properties"/>
+    <ds:schemaRef ds:uri="http://schemas.microsoft.com/office/infopath/2007/PartnerControls"/>
+    <ds:schemaRef ds:uri="443cdf4c-6ee8-44c1-87a5-09d4e47d10ca"/>
   </ds:schemaRefs>
 </ds:datastoreItem>
 </file>
</xml_diff>